<commit_message>
Center asterisk section breaks via pandoc lua filter
Apply a lua filter that catches paragraphs containing only '* * *'
and replaces them with raw OOXML setting w:jc center alignment.

Verified Ch. 10 P11: text '* * *', Normal style, align=center.

Co-Authored-By: Claude Opus 4.7 (1M context) <noreply@anthropic.com>
</commit_message>
<xml_diff>
--- a/valley-of-shadows/editions/1.2/chapter-16.docx
+++ b/valley-of-shadows/editions/1.2/chapter-16.docx
@@ -205,7 +205,7 @@
     </w:p>
     <w:p>
       <w:pPr>
-        <w:pStyle w:val="BodyText"/>
+        <w:jc w:val="center"/>
       </w:pPr>
       <w:r>
         <w:t xml:space="preserve">* * *</w:t>
@@ -285,7 +285,7 @@
     </w:p>
     <w:p>
       <w:pPr>
-        <w:pStyle w:val="BodyText"/>
+        <w:jc w:val="center"/>
       </w:pPr>
       <w:r>
         <w:t xml:space="preserve">* * *</w:t>
@@ -373,7 +373,7 @@
     </w:p>
     <w:p>
       <w:pPr>
-        <w:pStyle w:val="BodyText"/>
+        <w:jc w:val="center"/>
       </w:pPr>
       <w:r>
         <w:t xml:space="preserve">* * *</w:t>
@@ -493,7 +493,7 @@
     </w:p>
     <w:p>
       <w:pPr>
-        <w:pStyle w:val="BodyText"/>
+        <w:jc w:val="center"/>
       </w:pPr>
       <w:r>
         <w:t xml:space="preserve">* * *</w:t>
@@ -541,7 +541,7 @@
     </w:p>
     <w:p>
       <w:pPr>
-        <w:pStyle w:val="BodyText"/>
+        <w:jc w:val="center"/>
       </w:pPr>
       <w:r>
         <w:t xml:space="preserve">* * *</w:t>
@@ -645,7 +645,7 @@
     </w:p>
     <w:p>
       <w:pPr>
-        <w:pStyle w:val="BodyText"/>
+        <w:jc w:val="center"/>
       </w:pPr>
       <w:r>
         <w:t xml:space="preserve">* * *</w:t>

</xml_diff>